<commit_message>
docs: update project design with October 22 implementation changes
</commit_message>
<xml_diff>
--- a/MeterTrail_Project_Design_V1.1.docx
+++ b/MeterTrail_Project_Design_V1.1.docx
@@ -12,7 +12,7 @@
     </w:p>
     <w:p>
       <w:r>
-        <w:t>文档修订 V1.1  产品目标版本 V1.0  开发基线与验收规格</w:t>
+        <w:t>文档修订 V1.1  产品目标版本 V1.0  开发基线与验收规格  更新日期 2026年10月22日</w:t>
       </w:r>
     </w:p>
     <w:p>
@@ -30,7 +30,7 @@
     </w:p>
     <w:p>
       <w:r>
-        <w:t>本文汇总当前会话已确认要求，并对实现所必需的细节给出建议基线。所有系统均尚未实现、压测或上线；本文不表示支付审核已通过，也不表示达到可用性承诺。</w:t>
+        <w:t>本文记录产品设计基线及截至2026年10月22日的实现变更。核心采集、控制台与真实邮件链路已部署并开展功能验收；支付、GitHub OAuth、容量及异机恢复仍需专项验证。设计要求不等于全部实现，也不表示达到可用性承诺。</w:t>
       </w:r>
     </w:p>
     <w:p>
@@ -1409,15 +1409,8 @@
             <w:shd w:fill="FFFFFF"/>
           </w:tcPr>
           <w:p>
-            <w:pPr>
-              <w:spacing w:after="60" w:before="60"/>
-            </w:pPr>
             <w:r>
-              <w:rPr>
-                <w:b w:val="0"/>
-                <w:sz w:val="17"/>
-              </w:rPr>
-              <w:t>邮箱密码与 GitHub</w:t>
+              <w:t>邮箱密码与GitHub；可选保持登录30天</w:t>
             </w:r>
           </w:p>
         </w:tc>
@@ -1717,15 +1710,8 @@
             <w:shd w:fill="FFFFFF"/>
           </w:tcPr>
           <w:p>
-            <w:pPr>
-              <w:spacing w:after="60" w:before="60"/>
-            </w:pPr>
             <w:r>
-              <w:rPr>
-                <w:b w:val="0"/>
-                <w:sz w:val="17"/>
-              </w:rPr>
-              <w:t>项目与用量总览</w:t>
+              <w:t>工作空间订阅与用量、项目统计列表、新建和选择项目</w:t>
             </w:r>
           </w:p>
         </w:tc>
@@ -1769,15 +1755,8 @@
             <w:shd w:fill="F6F8FB"/>
           </w:tcPr>
           <w:p>
-            <w:pPr>
-              <w:spacing w:after="60" w:before="60"/>
-            </w:pPr>
             <w:r>
-              <w:rPr>
-                <w:b w:val="0"/>
-                <w:sz w:val="17"/>
-              </w:rPr>
-              <w:t>项目列表</w:t>
+              <w:t>项目列表已合并</w:t>
             </w:r>
           </w:p>
         </w:tc>
@@ -1794,15 +1773,8 @@
             <w:shd w:fill="F6F8FB"/>
           </w:tcPr>
           <w:p>
-            <w:pPr>
-              <w:spacing w:after="60" w:before="60"/>
-            </w:pPr>
             <w:r>
-              <w:rPr>
-                <w:b w:val="0"/>
-                <w:sz w:val="17"/>
-              </w:rPr>
-              <w:t>创建和选择</w:t>
+              <w:t>并入工作空间；旧/app/projects重定向/app/workspace</w:t>
             </w:r>
           </w:p>
         </w:tc>
@@ -2179,15 +2151,8 @@
             <w:shd w:fill="FFFFFF"/>
           </w:tcPr>
           <w:p>
-            <w:pPr>
-              <w:spacing w:after="60" w:before="60"/>
-            </w:pPr>
             <w:r>
-              <w:rPr>
-                <w:b w:val="0"/>
-                <w:sz w:val="17"/>
-              </w:rPr>
-              <w:t>示例、创建、轮换、撤销</w:t>
+              <w:t>创建、轮换、撤销及删除已撤销密钥；不删除上报数据</w:t>
             </w:r>
           </w:p>
         </w:tc>
@@ -2256,15 +2221,8 @@
             <w:shd w:fill="F6F8FB"/>
           </w:tcPr>
           <w:p>
-            <w:pPr>
-              <w:spacing w:after="60" w:before="60"/>
-            </w:pPr>
             <w:r>
-              <w:rPr>
-                <w:b w:val="0"/>
-                <w:sz w:val="17"/>
-              </w:rPr>
-              <w:t>规则、触发记录、通知</w:t>
+              <w:t>创建、启停与删除规则，保留历史触发与通知记录</w:t>
             </w:r>
           </w:p>
         </w:tc>
@@ -2581,7 +2539,7 @@
     <w:p/>
     <w:p>
       <w:r>
-        <w:t>另含 3 个内部 Grafana 仪表盘，以及隐私政策、服务条款、退款政策 3 个静态页，总计 26 个页面或仪表盘。支付使用托管收银台，不自建银行卡输入页。</w:t>
+        <w:t>页面清单保留原编号便于追溯；原第10项项目列表已合并到工作空间，不再作为独立菜单。另规划3个内部Grafana仪表盘，以及隐私政策、服务条款、退款政策3个静态页。支付使用托管收银台，不自建银行卡输入页。</w:t>
       </w:r>
     </w:p>
     <w:p>
@@ -2947,7 +2905,7 @@
     </w:p>
     <w:p>
       <w:r>
-        <w:t>控制台使用短期访问 JWT 与可撤销的刷新会话，或等价的服务端会话。建议刷新凭证置 HttpOnly、Secure Cookie，配合 CSRF 防护；改密与重置密码撤销既有会话。密码使用 Argon2id 或 bcrypt 等适合密码的哈希算法。</w:t>
+        <w:t>控制台使用可撤销的服务端会话和HttpOnly Cookie，生产环境启用Secure与SameSite=Lax并执行CSRF校验。普通登录有效期12小时；勾选保持登录时固定有效期30天，Cookie与数据库到期时间一致。退出登录撤销当前会话，重置密码与修改邮箱撤销既有会话；账号页展示实际到期时间。密码使用bcrypt。</w:t>
       </w:r>
     </w:p>
     <w:tbl>
@@ -3353,7 +3311,7 @@
     </w:p>
     <w:p>
       <w:r>
-        <w:t>HTTPS＋Authorization: Bearer lm_live_…；不增加 JWT 换取或 HMAC 请求签名。随机密钥至少 256 位熵，保存前缀和哈希；仅创建时完整展示，权限固定为单项目 events:write。撤销必须使鉴权缓存失效。轮换允许新旧并存，迁移后撤销旧密钥。</w:t>
+        <w:t>HTTPS与Authorization: Bearer lm_live_…；不增加JWT换取或HMAC请求签名。随机密钥保存前缀和哈希，仅创建时完整展示，权限固定为单项目events:write。撤销立即失效；轮换时创建新密钥、迁移应用后撤销旧密钥。仅已撤销密钥可删除，删除从列表隐藏，不删除上报数据或用量，审计保留。</w:t>
       </w:r>
     </w:p>
     <w:p>
@@ -6660,7 +6618,7 @@
     </w:p>
     <w:p>
       <w:r>
-        <w:t>明细按套餐生命周期分区与归档；账单、去重身份、审计、备份分别制定保留政策。删项目不直接删掉法定需留存账单，保留最少必要字段并告知用户。备份包含恢复步骤、加密和访问权限，定期验证恢复。</w:t>
+        <w:t>上报明细继续按套餐保存期限清理，删除密钥不改变数据保留期限。告警规则可删除，删除后停止检测且不得重新启用，既有告警和审计记录保留。密钥与规则采用deleted_at标记，规则同时enabled=false。账单、去重身份、审计、备份分别制定保留政策；明细分区归档与异机恢复能力仍需专项实施或验证。</w:t>
       </w:r>
     </w:p>
     <w:p>
@@ -9003,7 +8961,7 @@
     </w:p>
     <w:p>
       <w:r>
-        <w:t>文档修订 V1.1：正式采用品牌 MeterTrail，主域名 metertrail.com。依据用户确认，域名已注册；DNS、HTTPS和应用部署状态尚未验证。本次修订仅更新品牌、域名和中英文UI参考，不改变已确认套餐、安全、协议及发布规则。</w:t>
+        <w:t>正式采用MeterTrail品牌与metertrail.com主域名。主域名DNS、HTTPS和应用部署已在功能验收中验证。以下记录当前实际入口；独立app与ingest子域可作为后续拓扑规划，不视为已启用。</w:t>
       </w:r>
     </w:p>
     <w:p>
@@ -9021,12 +8979,12 @@
     </w:p>
     <w:p>
       <w:r>
-        <w:t>https://app.metertrail.com  用户控制台。</w:t>
+        <w:t>https://metertrail.com/app/workspace  当前工作空间与项目管理入口。</w:t>
       </w:r>
     </w:p>
     <w:p>
       <w:r>
-        <w:t>https://ingest.metertrail.com/v1/events/batch  SDK与REST批量上报。</w:t>
+        <w:t>https://metertrail.com/v1/events/batch  当前SDK与REST批量上报入口。</w:t>
       </w:r>
     </w:p>
     <w:p>
@@ -9036,7 +8994,7 @@
     </w:p>
     <w:p>
       <w:r>
-        <w:t>上报示例环境变量统一使用 METERTRAIL_API_KEY 与 METERTRAIL_ENDPOINT。域名规划不表示已解析或已开通；部署时分别配置TLS证书、DNS记录与OAuth回调白名单。</w:t>
+        <w:t>环境变量统一使用METERTRAIL_API_KEY与METERTRAIL_ENDPOINT；当前生产ENDPOINT为https://metertrail.com。后续拆分子域需另外配置DNS、TLS、Cookie策略与OAuth回调白名单。</w:t>
       </w:r>
     </w:p>
     <w:p>
@@ -9191,6 +9149,128 @@
     <w:p>
       <w:r>
         <w:t>嵌入原始高清图片，示例数据仅用于视觉表达。逐页实现需校对错误提示、计量说明、角色权限和空状态，不以图片替代接口或验收规格。</w:t>
+      </w:r>
+    </w:p>
+    <w:p>
+      <w:r>
+        <w:br w:type="page"/>
+      </w:r>
+    </w:p>
+    <w:p>
+      <w:pPr>
+        <w:pStyle w:val="Heading1"/>
+      </w:pPr>
+      <w:r>
+        <w:t>17 实现变更与验收状态</w:t>
+      </w:r>
+    </w:p>
+    <w:p>
+      <w:r>
+        <w:t>本节更新于2026年10月22日，汇总当天变更及本轮连续验收中已完成的相关调整。截图中的旧界面仅作视觉参考，交互规则以本节和前文更新为准。代码提交与本地检查通过不等于服务器已更新或所有生产验收已完成。</w:t>
+      </w:r>
+    </w:p>
+    <w:p>
+      <w:pPr>
+        <w:pStyle w:val="Heading2"/>
+      </w:pPr>
+      <w:r>
+        <w:t>项目管理与删除行为</w:t>
+      </w:r>
+    </w:p>
+    <w:p>
+      <w:r>
+        <w:t>工作空间统一展示项目、调用量、对象数、模型成本和未知成本调用，并提供新建项目。移除独立项目菜单；原项目页跳转工作空间。点击项目进入概览，项目设置继续管理当前项目。已撤销密钥新增删除入口，服务端拒绝直接删除有效密钥。告警规则支持删除并停止后续检测；历史告警、上报明细、计费用量和审计不随之删除。新增V9迁移为密钥及规则增加deleted_at。</w:t>
+      </w:r>
+    </w:p>
+    <w:p>
+      <w:pPr>
+        <w:pStyle w:val="Heading2"/>
+      </w:pPr>
+      <w:r>
+        <w:t>开发者文档与SDK仓库</w:t>
+      </w:r>
+    </w:p>
+    <w:p>
+      <w:r>
+        <w:t>文档左侧导航保持可见，点击后仅切换右侧章节，支持hash直达与浏览器返回。统一首页和文档页导航容器及滚动条占位，避免切换时位置偏移。七种REST示例按格式化后的换行缩进展示，一键复制保留原格式；移除快速开始上方的开始接入小标题，开发者文档侧栏标题与链接同为15px。</w:t>
+      </w:r>
+    </w:p>
+    <w:p>
+      <w:pPr>
+        <w:pStyle w:val="Heading2"/>
+      </w:pPr>
+      <w:r>
+        <w:t>SDK发布边界</w:t>
+      </w:r>
+    </w:p>
+    <w:p>
+      <w:r>
+        <w:t>Node.js与TypeScript、Python、Java源代码SDK已上传https://github.com/zhiyuan213/llm-usage-monitor-sdk，分别位于node、python、java。网站SDK区、包元数据与安装说明指向独立仓库，三种语言CI通过。尚未发布npm、PyPI或Maven Central；使用仓库与源码安装说明，不宣称已存在公开包。</w:t>
+      </w:r>
+    </w:p>
+    <w:p>
+      <w:pPr>
+        <w:pStyle w:val="Heading2"/>
+      </w:pPr>
+      <w:r>
+        <w:t>登录状态与首页</w:t>
+      </w:r>
+    </w:p>
+    <w:p>
+      <w:r>
+        <w:t>保持登录30天使用固定到期服务端会话，不保存明文密码。已登录用户访问首页显示进入控制台，登录页已有有效会话可进入概览。侧栏账号截断时悬停显示完整邮箱；账号页展示实际会话到期时间，旧会话不会因上线自动延长。 首页与底部主按钮在登录态确认前保留空位，确认后仅展示最终操作文案，避免免费开始闪换为进入控制台。</w:t>
+      </w:r>
+    </w:p>
+    <w:p>
+      <w:pPr>
+        <w:pStyle w:val="Heading2"/>
+      </w:pPr>
+      <w:r>
+        <w:t>告警计算与邮件</w:t>
+      </w:r>
+    </w:p>
+    <w:p>
+      <w:r>
+        <w:t>每分钟评估最近一小时数据，latency_ms使用上报durationMs的最大值，非采集接口自身响应时间。durationMs来自应用或SDK采集上报，错误填报会影响判断。相同对象版本仅通知一次，冷却一小时期间记录新增匹配证据，冷却结束合并通知；无新证据不重复发送。V8迁移记录历史证据，排除未来事件参与当前评估。邮件投递失败重试仍可能存在不确定送达后的重复邮件。</w:t>
+      </w:r>
+    </w:p>
+    <w:p>
+      <w:pPr>
+        <w:pStyle w:val="Heading2"/>
+      </w:pPr>
+      <w:r>
+        <w:t>控制台性能与品牌</w:t>
+      </w:r>
+    </w:p>
+    <w:p>
+      <w:r>
+        <w:t>共享项目与账号上下文采用30秒缓存并合并并发请求，减少重复串行获取；页面业务数据保持刷新，并丢弃过期请求结果。刷新保持原布局，宽屏提升字号与内容利用率。浏览器标签、收藏夹及移动收藏图标采用蓝底白色波形，与页面品牌一致。桌面首页压缩主视觉、功能区、底部入口和页脚留白，保留正常字号，小屏内容继续滚动。</w:t>
+      </w:r>
+    </w:p>
+    <w:p>
+      <w:pPr>
+        <w:pStyle w:val="Heading2"/>
+      </w:pPr>
+      <w:r>
+        <w:t>安全与验证证据</w:t>
+      </w:r>
+    </w:p>
+    <w:p>
+      <w:r>
+        <w:t>修复Trivy Action不存在的版本引用并固定到已验证提交；PostgreSQL JDBC升级42.7.14，保留安全扫描。删除功能本地后端35项测试、前端5项测试及构建通过，覆盖CSRF、跨项目ID、有效密钥禁止删除、删除后数据与用量保留、告警历史保留及规则不可重新启用。SDK三语言CI通过；本次图标、首页间距与登录态按钮优化通过前端5项测试、类型检查和生产构建，并检查了本地首页。</w:t>
+      </w:r>
+    </w:p>
+    <w:p>
+      <w:pPr>
+        <w:pStyle w:val="Heading2"/>
+      </w:pPr>
+      <w:r>
+        <w:t>后续验收与部署</w:t>
+      </w:r>
+    </w:p>
+    <w:p>
+      <w:r>
+        <w:t>仍需完成跨账号隔离、项目资料与删除、修改邮箱、密码重置后旧会话与旧密码失效、告警冷却合并等生产验收。审计IP显示代理内网地址的问题待处理。GitHub OAuth、支付真实环境、异机备份恢复与容量压测尚未形成完整上线证据。数据库迁移到托管PostgreSQL安排在功能验证之后。删除功能更新需重建api-blue与web并重启api-blue、worker、web，数据库自动执行V9；不得删除持久化卷。</w:t>
       </w:r>
     </w:p>
     <w:sectPr>

</xml_diff>